<commit_message>
Fix GST report crash and improve data layout readability
</commit_message>
<xml_diff>
--- a/Update Log.docx
+++ b/Update Log.docx
@@ -4609,14 +4609,23 @@
           <w:numId w:val="2"/>
         </w:numPr>
         <w:rPr>
-          <w:lang w:val="en-US"/>
-        </w:rPr>
-      </w:pPr>
-      <w:r>
-        <w:rPr>
-          <w:lang w:val="en-US"/>
-        </w:rPr>
-        <w:t>Provide Hide / Unhide button for KPI’s</w:t>
+          <w:color w:val="00B050"/>
+          <w:lang w:val="en-US"/>
+        </w:rPr>
+      </w:pPr>
+      <w:r>
+        <w:rPr>
+          <w:color w:val="00B050"/>
+          <w:lang w:val="en-US"/>
+        </w:rPr>
+        <w:t>Occupy full window.</w:t>
+      </w:r>
+      <w:r>
+        <w:rPr>
+          <w:color w:val="00B050"/>
+          <w:lang w:val="en-US"/>
+        </w:rPr>
+        <w:t xml:space="preserve"> </w:t>
       </w:r>
     </w:p>
     <w:p>
@@ -4627,14 +4636,16 @@
           <w:numId w:val="2"/>
         </w:numPr>
         <w:rPr>
-          <w:lang w:val="en-US"/>
-        </w:rPr>
-      </w:pPr>
-      <w:r>
-        <w:rPr>
-          <w:lang w:val="en-US"/>
-        </w:rPr>
-        <w:t>Make all the windows more readable by using partitions or tables.</w:t>
+          <w:color w:val="00B050"/>
+          <w:lang w:val="en-US"/>
+        </w:rPr>
+      </w:pPr>
+      <w:r>
+        <w:rPr>
+          <w:color w:val="00B050"/>
+          <w:lang w:val="en-US"/>
+        </w:rPr>
+        <w:t>Remove Hard coded credentials from login screen.</w:t>
       </w:r>
     </w:p>
     <w:p>
@@ -4645,14 +4656,16 @@
           <w:numId w:val="2"/>
         </w:numPr>
         <w:rPr>
-          <w:lang w:val="en-US"/>
-        </w:rPr>
-      </w:pPr>
-      <w:r>
-        <w:rPr>
-          <w:lang w:val="en-US"/>
-        </w:rPr>
-        <w:t>Provide a, ‘Site Documents’ Module, where I can upload relevant site documents.</w:t>
+          <w:color w:val="00B050"/>
+          <w:lang w:val="en-US"/>
+        </w:rPr>
+      </w:pPr>
+      <w:r>
+        <w:rPr>
+          <w:color w:val="00B050"/>
+          <w:lang w:val="en-US"/>
+        </w:rPr>
+        <w:t>Provide Hide / Unhide button for KPI’s</w:t>
       </w:r>
     </w:p>
     <w:p>
@@ -4668,9 +4681,51 @@
       </w:pPr>
       <w:r>
         <w:rPr>
-          <w:lang w:val="en-US"/>
-        </w:rPr>
-        <w:t>In USER Master, while assigning Module Access to users, ask for selecting sub module items also.</w:t>
+          <w:color w:val="00B050"/>
+          <w:lang w:val="en-US"/>
+        </w:rPr>
+        <w:t>In all modules, m</w:t>
+      </w:r>
+      <w:r>
+        <w:rPr>
+          <w:color w:val="00B050"/>
+          <w:lang w:val="en-US"/>
+        </w:rPr>
+        <w:t xml:space="preserve">ake all the </w:t>
+      </w:r>
+      <w:r>
+        <w:rPr>
+          <w:color w:val="00B050"/>
+          <w:lang w:val="en-US"/>
+        </w:rPr>
+        <w:t>data</w:t>
+      </w:r>
+      <w:r>
+        <w:rPr>
+          <w:color w:val="00B050"/>
+          <w:lang w:val="en-US"/>
+        </w:rPr>
+        <w:t xml:space="preserve"> </w:t>
+      </w:r>
+      <w:r>
+        <w:rPr>
+          <w:color w:val="00B050"/>
+          <w:lang w:val="en-US"/>
+        </w:rPr>
+        <w:t>better</w:t>
+      </w:r>
+      <w:r>
+        <w:rPr>
+          <w:color w:val="00B050"/>
+          <w:lang w:val="en-US"/>
+        </w:rPr>
+        <w:t xml:space="preserve"> readable by using partitions or tables</w:t>
+      </w:r>
+      <w:r>
+        <w:rPr>
+          <w:lang w:val="en-US"/>
+        </w:rPr>
+        <w:t>.</w:t>
       </w:r>
     </w:p>
     <w:p>
@@ -4688,7 +4743,55 @@
         <w:rPr>
           <w:lang w:val="en-US"/>
         </w:rPr>
-        <w:t>All Saved actions will take effect after</w:t>
+        <w:t>Provide a, ‘Site Documents’ Module, where I can upload relevant site documents.</w:t>
+      </w:r>
+    </w:p>
+    <w:p>
+      <w:pPr>
+        <w:pStyle w:val="ListParagraph"/>
+        <w:numPr>
+          <w:ilvl w:val="0"/>
+          <w:numId w:val="2"/>
+        </w:numPr>
+        <w:rPr>
+          <w:lang w:val="en-US"/>
+        </w:rPr>
+      </w:pPr>
+      <w:r>
+        <w:rPr>
+          <w:lang w:val="en-US"/>
+        </w:rPr>
+        <w:t>In USER Master, while assigning Module Access to users, ask for selecting sub module items also.</w:t>
+      </w:r>
+    </w:p>
+    <w:p>
+      <w:pPr>
+        <w:pStyle w:val="ListParagraph"/>
+        <w:numPr>
+          <w:ilvl w:val="0"/>
+          <w:numId w:val="2"/>
+        </w:numPr>
+        <w:rPr>
+          <w:lang w:val="en-US"/>
+        </w:rPr>
+      </w:pPr>
+      <w:r>
+        <w:rPr>
+          <w:lang w:val="en-US"/>
+        </w:rPr>
+        <w:t xml:space="preserve">All Saved actions </w:t>
+      </w:r>
+      <w:r>
+        <w:rPr>
+          <w:lang w:val="en-US"/>
+        </w:rPr>
+        <w:t xml:space="preserve">by all users </w:t>
+      </w:r>
+      <w:r>
+        <w:rPr>
+          <w:lang w:val="en-US"/>
+        </w:rPr>
+        <w:t>will take effect after</w:t>
       </w:r>
       <w:r>
         <w:rPr>

</xml_diff>